<commit_message>
Actualizar reportes de defectos manuales
Co-authored-by: Copilot <223556219+Copilot@users.noreply.github.com>
</commit_message>
<xml_diff>
--- a/reportes/ejecucion-manual/BUG-001-busqueda-sin-resultados.docx
+++ b/reportes/ejecucion-manual/BUG-001-busqueda-sin-resultados.docx
@@ -21,7 +21,7 @@
           <w:szCs w:val="28"/>
           <w:u w:val="single"/>
         </w:rPr>
-        <w:t>PLANTILLA DE REPORTE DE ERROR</w:t>
+        <w:t>REPORTE DE ERROR</w:t>
       </w:r>
     </w:p>
     <w:p>
@@ -436,12 +436,21 @@
             <w:vAlign w:val="bottom"/>
           </w:tcPr>
           <w:p>
+            <w:proofErr w:type="spellStart"/>
             <w:r>
               <w:rPr>
                 <w:rFonts w:ascii="Calibri" w:hAnsi="Calibri"/>
                 <w:sz w:val="20"/>
               </w:rPr>
-              <w:t>Chromium integrado</w:t>
+              <w:t>Chromium</w:t>
+            </w:r>
+            <w:proofErr w:type="spellEnd"/>
+            <w:r>
+              <w:rPr>
+                <w:rFonts w:ascii="Calibri" w:hAnsi="Calibri"/>
+                <w:sz w:val="20"/>
+              </w:rPr>
+              <w:t xml:space="preserve"> integrado</w:t>
             </w:r>
           </w:p>
         </w:tc>
@@ -612,6 +621,7 @@
           <w:szCs w:val="20"/>
         </w:rPr>
       </w:pPr>
+      <w:proofErr w:type="gramStart"/>
       <w:r>
         <w:rPr>
           <w:rFonts w:ascii="Calibri" w:hAnsi="Calibri"/>
@@ -620,7 +630,62 @@
           <w:sz w:val="21"/>
           <w:szCs w:val="20"/>
         </w:rPr>
-        <w:t>Al buscar el término improbable productoXYZ987654 en el catálogo, no aparecen productos, pero el área de resultados muestra “Your shopping cart is empty!”, mensaje propio del carrito. La búsqueda se repitió y el mensaje fue el mismo. Esto puede confundir al usuario sobre el estado de su búsqueda.</w:t>
+        <w:t xml:space="preserve">Al buscar el término improbable productoXYZ987654 en el catálogo, no aparecen productos, pero el área de resultados muestra “Your shopping </w:t>
+      </w:r>
+      <w:proofErr w:type="spellStart"/>
+      <w:r>
+        <w:rPr>
+          <w:rFonts w:ascii="Calibri" w:hAnsi="Calibri"/>
+          <w:iCs/>
+          <w:color w:val="4F81BD"/>
+          <w:sz w:val="21"/>
+          <w:szCs w:val="20"/>
+        </w:rPr>
+        <w:t>cart</w:t>
+      </w:r>
+      <w:proofErr w:type="spellEnd"/>
+      <w:r>
+        <w:rPr>
+          <w:rFonts w:ascii="Calibri" w:hAnsi="Calibri"/>
+          <w:iCs/>
+          <w:color w:val="4F81BD"/>
+          <w:sz w:val="21"/>
+          <w:szCs w:val="20"/>
+        </w:rPr>
+        <w:t xml:space="preserve"> is </w:t>
+      </w:r>
+      <w:proofErr w:type="spellStart"/>
+      <w:r>
+        <w:rPr>
+          <w:rFonts w:ascii="Calibri" w:hAnsi="Calibri"/>
+          <w:iCs/>
+          <w:color w:val="4F81BD"/>
+          <w:sz w:val="21"/>
+          <w:szCs w:val="20"/>
+        </w:rPr>
+        <w:t>empty</w:t>
+      </w:r>
+      <w:proofErr w:type="spellEnd"/>
+      <w:r>
+        <w:rPr>
+          <w:rFonts w:ascii="Calibri" w:hAnsi="Calibri"/>
+          <w:iCs/>
+          <w:color w:val="4F81BD"/>
+          <w:sz w:val="21"/>
+          <w:szCs w:val="20"/>
+        </w:rPr>
+        <w:t>!</w:t>
+      </w:r>
+      <w:proofErr w:type="gramEnd"/>
+      <w:r>
+        <w:rPr>
+          <w:rFonts w:ascii="Calibri" w:hAnsi="Calibri"/>
+          <w:iCs/>
+          <w:color w:val="4F81BD"/>
+          <w:sz w:val="21"/>
+          <w:szCs w:val="20"/>
+        </w:rPr>
+        <w:t>”, mensaje propio del carrito. La búsqueda se repitió y el mensaje fue el mismo. Esto puede confundir al usuario sobre el estado de su búsqueda.</w:t>
       </w:r>
     </w:p>
     <w:p>
@@ -728,15 +793,7 @@
           <w:bCs/>
           <w:u w:val="single"/>
         </w:rPr>
-        <w:t>Resultado Espera</w:t>
-      </w:r>
-      <w:r>
-        <w:rPr>
-          <w:b/>
-          <w:bCs/>
-          <w:u w:val="single"/>
-        </w:rPr>
-        <w:t>do</w:t>
+        <w:t>Resultado Esperado</w:t>
       </w:r>
     </w:p>
     <w:p>
@@ -803,7 +860,73 @@
           <w:sz w:val="21"/>
           <w:szCs w:val="20"/>
         </w:rPr>
-        <w:t>No se encontraron productos; sin embargo, el área de resultados mostró “Your shopping cart is empty!”. La misma respuesta apareció al repetir la búsqueda.</w:t>
+        <w:t xml:space="preserve">No se encontraron productos; </w:t>
+      </w:r>
+      <w:proofErr w:type="gramStart"/>
+      <w:r>
+        <w:rPr>
+          <w:rFonts w:ascii="Calibri" w:hAnsi="Calibri"/>
+          <w:iCs/>
+          <w:color w:val="4F81BD"/>
+          <w:sz w:val="21"/>
+          <w:szCs w:val="20"/>
+        </w:rPr>
+        <w:t xml:space="preserve">sin embargo, el área de resultados mostró “Your shopping </w:t>
+      </w:r>
+      <w:proofErr w:type="spellStart"/>
+      <w:r>
+        <w:rPr>
+          <w:rFonts w:ascii="Calibri" w:hAnsi="Calibri"/>
+          <w:iCs/>
+          <w:color w:val="4F81BD"/>
+          <w:sz w:val="21"/>
+          <w:szCs w:val="20"/>
+        </w:rPr>
+        <w:t>cart</w:t>
+      </w:r>
+      <w:proofErr w:type="spellEnd"/>
+      <w:r>
+        <w:rPr>
+          <w:rFonts w:ascii="Calibri" w:hAnsi="Calibri"/>
+          <w:iCs/>
+          <w:color w:val="4F81BD"/>
+          <w:sz w:val="21"/>
+          <w:szCs w:val="20"/>
+        </w:rPr>
+        <w:t xml:space="preserve"> is </w:t>
+      </w:r>
+      <w:proofErr w:type="spellStart"/>
+      <w:r>
+        <w:rPr>
+          <w:rFonts w:ascii="Calibri" w:hAnsi="Calibri"/>
+          <w:iCs/>
+          <w:color w:val="4F81BD"/>
+          <w:sz w:val="21"/>
+          <w:szCs w:val="20"/>
+        </w:rPr>
+        <w:t>empty</w:t>
+      </w:r>
+      <w:proofErr w:type="spellEnd"/>
+      <w:r>
+        <w:rPr>
+          <w:rFonts w:ascii="Calibri" w:hAnsi="Calibri"/>
+          <w:iCs/>
+          <w:color w:val="4F81BD"/>
+          <w:sz w:val="21"/>
+          <w:szCs w:val="20"/>
+        </w:rPr>
+        <w:t>!</w:t>
+      </w:r>
+      <w:proofErr w:type="gramEnd"/>
+      <w:r>
+        <w:rPr>
+          <w:rFonts w:ascii="Calibri" w:hAnsi="Calibri"/>
+          <w:iCs/>
+          <w:color w:val="4F81BD"/>
+          <w:sz w:val="21"/>
+          <w:szCs w:val="20"/>
+        </w:rPr>
+        <w:t>”. La misma respuesta apareció al repetir la búsqueda.</w:t>
       </w:r>
     </w:p>
     <w:p>

</xml_diff>